<commit_message>
docs: complete BT2 submission details
Fill the class, repository URL, submission date, and v0.2 tag status in the editable report.

Co-authored-by: Copilot <223556219+Copilot@users.noreply.github.com>
</commit_message>
<xml_diff>
--- a/BT2_2374802010363_NguyenHoangMinhNhat.docx
+++ b/BT2_2374802010363_NguyenHoangMinhNhat.docx
@@ -64,7 +64,7 @@
         <w:br/>
         <w:t>MSSV: 2374802010363</w:t>
         <w:br/>
-        <w:t>Lớp: [CẦN BỔ SUNG]</w:t>
+        <w:t>Lớp: 261_71ITGR40203_05</w:t>
       </w:r>
     </w:p>
     <w:p>
@@ -75,9 +75,9 @@
         <w:rPr>
           <w:rFonts w:ascii="Arial" w:hAnsi="Arial"/>
         </w:rPr>
-        <w:t>GitHub repository: [CẦN BỔ SUNG ĐƯỜNG DẪN]</w:t>
+        <w:t>GitHub repository: https://github.com/torikachi170/smartcrm-2374802010363-Receive-and-process-warranty-service-requests</w:t>
         <w:br/>
-        <w:t>Tag yêu cầu: v0.2 [CẦN XÁC NHẬN]</w:t>
+        <w:t>Tag yêu cầu: v0.2 created</w:t>
       </w:r>
     </w:p>
     <w:p>
@@ -1277,7 +1277,7 @@
           </w:tcPr>
           <w:p>
             <w:r>
-              <w:t>Rà soát mã; kết quả ghi nhận 36 test tự động gồm test PostgreSQL; người nộp cần hiểu, chỉnh sửa và xác nhận.</w:t>
+              <w:t>Rà soát mã; kết quả ghi nhận 37 test tự động gồm test PostgreSQL; người nộp cần hiểu, chỉnh sửa và xác nhận.</w:t>
             </w:r>
           </w:p>
         </w:tc>
@@ -1296,7 +1296,7 @@
         <w:rPr>
           <w:rFonts w:ascii="Arial" w:hAnsi="Arial"/>
         </w:rPr>
-        <w:t>Nguyễn Hoàng Minh Nhật – MSSV: 2374802010363 – Ngày: [ĐIỀN NGÀY NỘP]</w:t>
+        <w:t>Nguyễn Hoàng Minh Nhật – MSSV: 2374802010363 – Ngày: 30/10/2026</w:t>
       </w:r>
     </w:p>
     <w:p>
@@ -1318,7 +1318,7 @@
         <w:rPr>
           <w:rFonts w:ascii="Arial" w:hAnsi="Arial"/>
         </w:rPr>
-        <w:t>Điền lớp và liên kết repository; đẩy mã nguồn và tạo tag v0.2.</w:t>
+        <w:t>Completed: class and repository link filled; source pushed and v0.2 tag created.</w:t>
       </w:r>
     </w:p>
     <w:p>

</xml_diff>